<commit_message>
pp-salygos: D2 numeracija pagal paketą - priedų failai ir antraštės pagal sąrašą, SPS lentelių pernumeravimas, formų nuorodos į SPS punktus ir lenteles; šablonų taisymai AE-AG; MVP/ND be žaliųjų nebetrina „KITI REIKALAVIMAI“ lentelės
- priedų ir priedėlių antraštės galutiniu numeriu visose šeimose, DPS žymos, DPS LT/EN šeimos priedai pagal sąrašo eilutę
- SPS lentelės iš eilės, kai dalis pašalinta (antraštės ir nuorodos; nuoroda į pašalintą - pagal pastraipos žodžius arba „Patikrinkite“)
- savininko rodyklė (Word automatiniai eilučių numeriai) - deklaracijos, pasiūlymo ir subtiekėjų formų nuorodos
- AE: ND LT/EN BPS 11.13.1 eilutė; AF: SSD 5 lentelė, DPSP LT forma 4, DPS LT/EN 2 priedo 2 lentelė; AG: „priedėlį“
- MVP LT, MVP LT/EN, ND LT: žaliųjų taisyklė valdo tik 3 lentelę (šablono nurodymas), antraštė seka savo lentelę
- testai: testaiD2 (26), 5 ankstesni pritaikyti; 562 testai

Co-Authored-By: Claude Opus 5.5 <noreply@anthropic.com>
</commit_message>
<xml_diff>
--- a/PP-salygos/templates/DPSK_LTEN_KVALIFIKACIJA.docx
+++ b/PP-salygos/templates/DPSK_LTEN_KVALIFIKACIJA.docx
@@ -3232,7 +3232,7 @@
                 <w:sz w:val="20"/>
                 <w:szCs w:val="20"/>
               </w:rPr>
-              <w:t>3 lentelėje</w:t>
+              <w:t>2 lentelėje</w:t>
             </w:r>
             <w:r>
               <w:rPr>
@@ -3538,7 +3538,7 @@
                 <w:szCs w:val="20"/>
                 <w:lang w:val="en-GB"/>
               </w:rPr>
-              <w:t>Table 3</w:t>
+              <w:t>Table 2</w:t>
             </w:r>
             <w:r>
               <w:rPr>
@@ -3721,7 +3721,7 @@
           <w:sz w:val="20"/>
           <w:szCs w:val="20"/>
         </w:rPr>
-        <w:t>3 lentelė/Table 3</w:t>
+        <w:t>2 lentelė/Table 2</w:t>
       </w:r>
     </w:p>
     <w:tbl>
@@ -4670,7 +4670,7 @@
                 <w:sz w:val="20"/>
                 <w:szCs w:val="20"/>
               </w:rPr>
-              <w:t xml:space="preserve">pagal SPS 3 lentelės reikalavimą </w:t>
+              <w:t xml:space="preserve">pagal šio priedo 2 lentelės reikalavimą </w:t>
             </w:r>
             <w:r>
               <w:rPr>
@@ -4721,7 +4721,7 @@
                 <w:szCs w:val="20"/>
                 <w:lang w:val="en-GB"/>
               </w:rPr>
-              <w:t xml:space="preserve">according to the requirement set out in SPC Table 3 </w:t>
+              <w:t xml:space="preserve">according to the requirement set out in Table 2 of this Annex </w:t>
             </w:r>
             <w:r>
               <w:rPr>
@@ -5128,7 +5128,7 @@
                 <w:szCs w:val="20"/>
                 <w:lang w:eastAsia="lt-LT"/>
               </w:rPr>
-              <w:t>Žaliuosius reikalavimus pagal SPS 3 lentelės reikalavimą turi atitikti Tiekėjas arba bent vienas Tiekėjų grupės narys. Subtiekėjams ar Ūkio subjektams, kurių pajėgumais remiamasi, šis reikalavimas nekeliamas.</w:t>
+              <w:t>Žaliuosius reikalavimus pagal šio priedo 2 lentelės reikalavimą turi atitikti Tiekėjas arba bent vienas Tiekėjų grupės narys. Subtiekėjams ar Ūkio subjektams, kurių pajėgumais remiamasi, šis reikalavimas nekeliamas.</w:t>
             </w:r>
           </w:p>
         </w:tc>
@@ -5159,7 +5159,7 @@
                 <w:szCs w:val="20"/>
                 <w:lang w:val="en-GB"/>
               </w:rPr>
-              <w:t>Environmental requirements according to the requirement set out in SPC Table 3 must be met by the Supplier or at least one member from the group of Suppliers. This requirement is not applied to Sub-suppliers or Economic Entities whose capacity is relied on.</w:t>
+              <w:t>Environmental requirements according to the requirement set out in Table 2 of this Annex must be met by the Supplier or at least one member from the group of Suppliers. This requirement is not applied to Sub-suppliers or Economic Entities whose capacity is relied on.</w:t>
             </w:r>
           </w:p>
         </w:tc>

</xml_diff>